<commit_message>
Word-Vorlage: Auftraggeber in Spalte 1, Jahre-Spalte entfernt
- Projekterfahrung: Auftraggeber in erste Spalte (Zeitraum/Auftraggeber/Rolle),
  Tabelle von 4 auf 3 Spalten reduziert
- Technologiekompetenz: Jahre-Spalte entfernt, 3 Spalten (Technologie/Kategorie/Level)

Co-Authored-By: Claude Sonnet 4.6 <noreply@anthropic.com>
</commit_message>
<xml_diff>
--- a/templates/profil.docx
+++ b/templates/profil.docx
@@ -114,15 +114,14 @@
         <w:tblLook w:firstColumn="1" w:firstRow="1" w:lastColumn="0" w:lastRow="0" w:noHBand="0" w:noVBand="1" w:val="04A0"/>
       </w:tblPr>
       <w:tblGrid>
-        <w:gridCol w:w="2160"/>
-        <w:gridCol w:w="2160"/>
-        <w:gridCol w:w="2160"/>
-        <w:gridCol w:w="2160"/>
+        <w:gridCol w:w="2880"/>
+        <w:gridCol w:w="2880"/>
+        <w:gridCol w:w="2880"/>
       </w:tblGrid>
       <w:tr>
         <w:tc>
           <w:tcPr>
-            <w:tcW w:type="dxa" w:w="2160"/>
+            <w:tcW w:type="dxa" w:w="2880"/>
           </w:tcPr>
           <w:p>
             <w:r>
@@ -135,7 +134,7 @@
         </w:tc>
         <w:tc>
           <w:tcPr>
-            <w:tcW w:type="dxa" w:w="2160"/>
+            <w:tcW w:type="dxa" w:w="2880"/>
           </w:tcPr>
           <w:p>
             <w:r>
@@ -148,7 +147,7 @@
         </w:tc>
         <w:tc>
           <w:tcPr>
-            <w:tcW w:type="dxa" w:w="2160"/>
+            <w:tcW w:type="dxa" w:w="2880"/>
           </w:tcPr>
           <w:p>
             <w:r>
@@ -159,24 +158,11 @@
             </w:r>
           </w:p>
         </w:tc>
-        <w:tc>
-          <w:tcPr>
-            <w:tcW w:type="dxa" w:w="2160"/>
-          </w:tcPr>
-          <w:p>
-            <w:r>
-              <w:rPr>
-                <w:b/>
-              </w:rPr>
-              <w:t>Jahre</w:t>
-            </w:r>
-          </w:p>
-        </w:tc>
       </w:tr>
       <w:tr>
         <w:tc>
           <w:tcPr>
-            <w:tcW w:type="dxa" w:w="2160"/>
+            <w:tcW w:type="dxa" w:w="2880"/>
           </w:tcPr>
           <w:p>
             <w:r>
@@ -186,19 +172,13 @@
         </w:tc>
         <w:tc>
           <w:tcPr>
-            <w:tcW w:type="dxa" w:w="2160"/>
+            <w:tcW w:type="dxa" w:w="2880"/>
           </w:tcPr>
           <w:p/>
         </w:tc>
         <w:tc>
           <w:tcPr>
-            <w:tcW w:type="dxa" w:w="2160"/>
-          </w:tcPr>
-          <w:p/>
-        </w:tc>
-        <w:tc>
-          <w:tcPr>
-            <w:tcW w:type="dxa" w:w="2160"/>
+            <w:tcW w:type="dxa" w:w="2880"/>
           </w:tcPr>
           <w:p/>
         </w:tc>
@@ -206,7 +186,7 @@
       <w:tr>
         <w:tc>
           <w:tcPr>
-            <w:tcW w:type="dxa" w:w="2160"/>
+            <w:tcW w:type="dxa" w:w="2880"/>
           </w:tcPr>
           <w:p>
             <w:r>
@@ -216,7 +196,7 @@
         </w:tc>
         <w:tc>
           <w:tcPr>
-            <w:tcW w:type="dxa" w:w="2160"/>
+            <w:tcW w:type="dxa" w:w="2880"/>
           </w:tcPr>
           <w:p>
             <w:r>
@@ -226,7 +206,7 @@
         </w:tc>
         <w:tc>
           <w:tcPr>
-            <w:tcW w:type="dxa" w:w="2160"/>
+            <w:tcW w:type="dxa" w:w="2880"/>
           </w:tcPr>
           <w:p>
             <w:r>
@@ -234,21 +214,11 @@
             </w:r>
           </w:p>
         </w:tc>
-        <w:tc>
-          <w:tcPr>
-            <w:tcW w:type="dxa" w:w="2160"/>
-          </w:tcPr>
-          <w:p>
-            <w:r>
-              <w:t>{{ tech.years }} J.</w:t>
-            </w:r>
-          </w:p>
-        </w:tc>
       </w:tr>
       <w:tr>
         <w:tc>
           <w:tcPr>
-            <w:tcW w:type="dxa" w:w="2160"/>
+            <w:tcW w:type="dxa" w:w="2880"/>
           </w:tcPr>
           <w:p>
             <w:r>
@@ -258,19 +228,13 @@
         </w:tc>
         <w:tc>
           <w:tcPr>
-            <w:tcW w:type="dxa" w:w="2160"/>
+            <w:tcW w:type="dxa" w:w="2880"/>
           </w:tcPr>
           <w:p/>
         </w:tc>
         <w:tc>
           <w:tcPr>
-            <w:tcW w:type="dxa" w:w="2160"/>
-          </w:tcPr>
-          <w:p/>
-        </w:tc>
-        <w:tc>
-          <w:tcPr>
-            <w:tcW w:type="dxa" w:w="2160"/>
+            <w:tcW w:type="dxa" w:w="2880"/>
           </w:tcPr>
           <w:p/>
         </w:tc>
@@ -291,28 +255,27 @@
         <w:tblLook w:firstColumn="1" w:firstRow="1" w:lastColumn="0" w:lastRow="0" w:noHBand="0" w:noVBand="1" w:val="04A0"/>
       </w:tblPr>
       <w:tblGrid>
-        <w:gridCol w:w="2160"/>
-        <w:gridCol w:w="2160"/>
-        <w:gridCol w:w="2160"/>
-        <w:gridCol w:w="2160"/>
+        <w:gridCol w:w="2880"/>
+        <w:gridCol w:w="2880"/>
+        <w:gridCol w:w="2880"/>
       </w:tblGrid>
       <w:tr>
         <w:tc>
           <w:tcPr>
-            <w:tcW w:type="dxa" w:w="2160"/>
+            <w:tcW w:type="dxa" w:w="2880"/>
           </w:tcPr>
           <w:p>
             <w:r>
               <w:rPr>
                 <w:b/>
               </w:rPr>
-              <w:t>Zeitraum / Rolle</w:t>
+              <w:t>Zeitraum / Auftraggeber / Rolle</w:t>
             </w:r>
           </w:p>
         </w:tc>
         <w:tc>
           <w:tcPr>
-            <w:tcW w:type="dxa" w:w="2160"/>
+            <w:tcW w:type="dxa" w:w="2880"/>
           </w:tcPr>
           <w:p>
             <w:r>
@@ -325,20 +288,7 @@
         </w:tc>
         <w:tc>
           <w:tcPr>
-            <w:tcW w:type="dxa" w:w="2160"/>
-          </w:tcPr>
-          <w:p>
-            <w:r>
-              <w:rPr>
-                <w:b/>
-              </w:rPr>
-              <w:t>Auftraggeber</w:t>
-            </w:r>
-          </w:p>
-        </w:tc>
-        <w:tc>
-          <w:tcPr>
-            <w:tcW w:type="dxa" w:w="2160"/>
+            <w:tcW w:type="dxa" w:w="2880"/>
           </w:tcPr>
           <w:p>
             <w:r>
@@ -353,7 +303,7 @@
       <w:tr>
         <w:tc>
           <w:tcPr>
-            <w:tcW w:type="dxa" w:w="2160"/>
+            <w:tcW w:type="dxa" w:w="2880"/>
           </w:tcPr>
           <w:p>
             <w:r>
@@ -363,19 +313,13 @@
         </w:tc>
         <w:tc>
           <w:tcPr>
-            <w:tcW w:type="dxa" w:w="2160"/>
+            <w:tcW w:type="dxa" w:w="2880"/>
           </w:tcPr>
           <w:p/>
         </w:tc>
         <w:tc>
           <w:tcPr>
-            <w:tcW w:type="dxa" w:w="2160"/>
-          </w:tcPr>
-          <w:p/>
-        </w:tc>
-        <w:tc>
-          <w:tcPr>
-            <w:tcW w:type="dxa" w:w="2160"/>
+            <w:tcW w:type="dxa" w:w="2880"/>
           </w:tcPr>
           <w:p/>
         </w:tc>
@@ -383,11 +327,16 @@
       <w:tr>
         <w:tc>
           <w:tcPr>
-            <w:tcW w:type="dxa" w:w="2160"/>
+            <w:tcW w:type="dxa" w:w="2880"/>
           </w:tcPr>
           <w:p>
             <w:r>
               <w:t>{{ p.start }}–{{ p.end }}</w:t>
+            </w:r>
+          </w:p>
+          <w:p>
+            <w:r>
+              <w:t>{{ p.auftraggeber_label }}</w:t>
             </w:r>
           </w:p>
           <w:p>
@@ -398,7 +347,7 @@
         </w:tc>
         <w:tc>
           <w:tcPr>
-            <w:tcW w:type="dxa" w:w="2160"/>
+            <w:tcW w:type="dxa" w:w="2880"/>
           </w:tcPr>
           <w:p>
             <w:r>
@@ -418,17 +367,7 @@
         </w:tc>
         <w:tc>
           <w:tcPr>
-            <w:tcW w:type="dxa" w:w="2160"/>
-          </w:tcPr>
-          <w:p>
-            <w:r>
-              <w:t>{{ p.auftraggeber_label }}</w:t>
-            </w:r>
-          </w:p>
-        </w:tc>
-        <w:tc>
-          <w:tcPr>
-            <w:tcW w:type="dxa" w:w="2160"/>
+            <w:tcW w:type="dxa" w:w="2880"/>
           </w:tcPr>
           <w:p>
             <w:r>
@@ -440,7 +379,7 @@
       <w:tr>
         <w:tc>
           <w:tcPr>
-            <w:tcW w:type="dxa" w:w="2160"/>
+            <w:tcW w:type="dxa" w:w="2880"/>
           </w:tcPr>
           <w:p>
             <w:r>
@@ -450,19 +389,13 @@
         </w:tc>
         <w:tc>
           <w:tcPr>
-            <w:tcW w:type="dxa" w:w="2160"/>
+            <w:tcW w:type="dxa" w:w="2880"/>
           </w:tcPr>
           <w:p/>
         </w:tc>
         <w:tc>
           <w:tcPr>
-            <w:tcW w:type="dxa" w:w="2160"/>
-          </w:tcPr>
-          <w:p/>
-        </w:tc>
-        <w:tc>
-          <w:tcPr>
-            <w:tcW w:type="dxa" w:w="2160"/>
+            <w:tcW w:type="dxa" w:w="2880"/>
           </w:tcPr>
           <w:p/>
         </w:tc>

</xml_diff>

<commit_message>
Word-Output: SK-Tabelle mit Spiegelstrich-Bullets + Matcher verbessert
Word-Generator (src/generators/word.py, templates/profil.docx):
- Schluesselkompetenzen-Tabelle: echte Word-Bullet-Formatierung mit
  Spiegelstrich (–) als Aufzaehlungszeichen via Numbering-XML
- Spalten 1/3 : 2/3 (Cm(5.5) : Cm(11.0))
- Begriff–Halbsatz-Trenner von ' — ' auf ': ' umgestellt
- Architekturstil-Zeile aus IT-Know-How entfernt

Matcher (src/matcher.py, tests/test_matcher.py):
- Compound-Split: 'Java oder TypeScript' wird in Alternativen zerlegt,
  jede einzeln gegen Corpus geprueft (0% → 57% auf adesso_ki)
- Token-Match: Corpus-Items als Tokens (≥4 Zeichen) — 'microservices'
  aus 'n-tier · soa · portal · microservices' matcht
  'Microservices-Architektur'
- Kurzteile (< 3 Zeichen) aus Compound-Split gefiltert (kein 'c' aus
  'C/C++')
- 13 neue Unit-Tests in tests/test_matcher.py

Co-Authored-By: Claude Sonnet 4.6 <noreply@anthropic.com>
</commit_message>
<xml_diff>
--- a/templates/profil.docx
+++ b/templates/profil.docx
@@ -109,7 +109,7 @@
       <w:tr>
         <w:tc>
           <w:tcPr>
-            <w:tcW w:type="dxa" w:w="4320"/>
+            <w:tcW w:type="dxa" w:w="3118"/>
           </w:tcPr>
           <w:p>
             <w:r>
@@ -119,7 +119,7 @@
         </w:tc>
         <w:tc>
           <w:tcPr>
-            <w:tcW w:type="dxa" w:w="4320"/>
+            <w:tcW w:type="dxa" w:w="6236"/>
           </w:tcPr>
           <w:p/>
         </w:tc>
@@ -127,7 +127,7 @@
       <w:tr>
         <w:tc>
           <w:tcPr>
-            <w:tcW w:type="dxa" w:w="4320"/>
+            <w:tcW w:type="dxa" w:w="3118"/>
           </w:tcPr>
           <w:p>
             <w:r>
@@ -137,11 +137,27 @@
         </w:tc>
         <w:tc>
           <w:tcPr>
-            <w:tcW w:type="dxa" w:w="4320"/>
+            <w:tcW w:type="dxa" w:w="6236"/>
           </w:tcPr>
           <w:p>
             <w:r>
-              <w:t>{{ kat.items_str }}</w:t>
+              <w:t>{%p for item in kat.eintraege %}</w:t>
+            </w:r>
+          </w:p>
+          <w:p>
+            <w:pPr>
+              <w:numPr>
+                <w:ilvl w:val="0"/>
+                <w:numId w:val="10"/>
+              </w:numPr>
+            </w:pPr>
+            <w:r>
+              <w:t>{{ item }}</w:t>
+            </w:r>
+          </w:p>
+          <w:p>
+            <w:r>
+              <w:t>{%p endfor %}</w:t>
             </w:r>
           </w:p>
         </w:tc>
@@ -149,7 +165,7 @@
       <w:tr>
         <w:tc>
           <w:tcPr>
-            <w:tcW w:type="dxa" w:w="4320"/>
+            <w:tcW w:type="dxa" w:w="3118"/>
           </w:tcPr>
           <w:p>
             <w:r>
@@ -159,7 +175,7 @@
         </w:tc>
         <w:tc>
           <w:tcPr>
-            <w:tcW w:type="dxa" w:w="4320"/>
+            <w:tcW w:type="dxa" w:w="6236"/>
           </w:tcPr>
           <w:p/>
         </w:tc>
@@ -189,21 +205,6 @@
       </w:pPr>
       <w:r>
         <w:t>{{ wg.reihenfolge }}. {{ wg.titel }}</w:t>
-      </w:r>
-    </w:p>
-    <w:p>
-      <w:r>
-        <w:t>{%p if wg.architekturstil %}</w:t>
-      </w:r>
-    </w:p>
-    <w:p>
-      <w:r>
-        <w:t>Architekturstil: {{ wg.architekturstil }}</w:t>
-      </w:r>
-    </w:p>
-    <w:p>
-      <w:r>
-        <w:t>{%p endif %}</w:t>
       </w:r>
     </w:p>
     <w:tbl>
@@ -1307,6 +1308,17 @@
       </w:rPr>
     </w:lvl>
   </w:abstractNum>
+  <w:abstractNum w:abstractNumId="9">
+    <w:lvl w:ilvl="0">
+      <w:start w:val="1"/>
+      <w:numFmt w:val="bullet"/>
+      <w:lvlText w:val="–"/>
+      <w:lvlJc w:val="left"/>
+      <w:pPr>
+        <w:ind w:left="360" w:hanging="180"/>
+      </w:pPr>
+    </w:lvl>
+  </w:abstractNum>
   <w:num w:numId="1">
     <w:abstractNumId w:val="8"/>
   </w:num>
@@ -1333,6 +1345,9 @@
   </w:num>
   <w:num w:numId="9">
     <w:abstractNumId w:val="0"/>
+  </w:num>
+  <w:num w:numId="10">
+    <w:abstractNumId w:val="9"/>
   </w:num>
 </w:numbering>
 </file>

</xml_diff>

<commit_message>
Word-Output: Zielrolle + Fuehrungskompetenz entfernt
- Zielrolle-Zeile aus Template entfernt
- Fuehrungskompetenz-Kategorie aus Schluesselkompetenzen-Tabelle
  herausgefiltert (key == 'fuehrungkompetenz' wird uebersprungen)

Co-Authored-By: Claude Sonnet 4.6 <noreply@anthropic.com>
</commit_message>
<xml_diff>
--- a/templates/profil.docx
+++ b/templates/profil.docx
@@ -61,21 +61,6 @@
     <w:p>
       <w:r>
         <w:t>{{ kurzprofil }}</w:t>
-      </w:r>
-    </w:p>
-    <w:p>
-      <w:r>
-        <w:t>{%p endif %}</w:t>
-      </w:r>
-    </w:p>
-    <w:p>
-      <w:r>
-        <w:t>{%p if zielrolle %}</w:t>
-      </w:r>
-    </w:p>
-    <w:p>
-      <w:r>
-        <w:t>Zielrolle: {{ zielrolle }}</w:t>
       </w:r>
     </w:p>
     <w:p>

</xml_diff>

<commit_message>
Word-Output: Header/Footer, Publikationen, Layout-Überarbeitung
- 2-spaltiger Kopfbereich (Name/Qualifikation links, Kontakt rechts)
- Header ab Seite 2: Name + STYLEREF Überschrift 2 (kein Rahmen)
- Footer: Datum | Version: Dateiname | Seite X von N
- Neue Grammatik-Entitäten: Publikation, qualifikation/strasse/plz_ort in Person/Kontakt
- Projekterfahrungs-Tabelle: Wissensgebiete-Spalte entfernt, 2-spaltig 33/67%
- Beruflicher Werdegang vor Projekterfahrung; Seitenumbrüche vor Werdegang, Projekterfahrung, Ausbildung, Sprachen
- Datumsformat MM.yyyy; Rollen vereinheitlicht (Software-Ingenieur / Senior)
- Fortbildung absteigend nach Jahr; Überschriften schwarz; Padding/Zeilenumbrüche

Co-Authored-By: Claude Sonnet 4.6 <noreply@anthropic.com>
</commit_message>
<xml_diff>
--- a/templates/profil.docx
+++ b/templates/profil.docx
@@ -2,52 +2,211 @@
 <file path=word/document.xml><?xml version="1.0" encoding="utf-8"?>
 <w:document xmlns:wpc="http://schemas.microsoft.com/office/word/2010/wordprocessingCanvas" xmlns:mo="http://schemas.microsoft.com/office/mac/office/2008/main" xmlns:mc="http://schemas.openxmlformats.org/markup-compatibility/2006" xmlns:mv="urn:schemas-microsoft-com:mac:vml" xmlns:o="urn:schemas-microsoft-com:office:office" xmlns:r="http://schemas.openxmlformats.org/officeDocument/2006/relationships" xmlns:m="http://schemas.openxmlformats.org/officeDocument/2006/math" xmlns:v="urn:schemas-microsoft-com:vml" xmlns:wp14="http://schemas.microsoft.com/office/word/2010/wordprocessingDrawing" xmlns:wp="http://schemas.openxmlformats.org/drawingml/2006/wordprocessingDrawing" xmlns:w10="urn:schemas-microsoft-com:office:word" xmlns:w="http://schemas.openxmlformats.org/wordprocessingml/2006/main" xmlns:w14="http://schemas.microsoft.com/office/word/2010/wordml" xmlns:wpg="http://schemas.microsoft.com/office/word/2010/wordprocessingGroup" xmlns:wpi="http://schemas.microsoft.com/office/word/2010/wordprocessingInk" xmlns:wne="http://schemas.microsoft.com/office/word/2006/wordml" xmlns:wps="http://schemas.microsoft.com/office/word/2010/wordprocessingShape" mc:Ignorable="w14 wp14">
   <w:body>
-    <w:p>
-      <w:pPr>
-        <w:pStyle w:val="Heading1"/>
-      </w:pPr>
-      <w:r>
-        <w:t>{{ person_title }}</w:t>
-      </w:r>
-    </w:p>
+    <w:tbl>
+      <w:tblPr>
+        <w:tblW w:type="auto" w:w="0"/>
+        <w:tblLook w:firstColumn="1" w:firstRow="1" w:lastColumn="0" w:lastRow="0" w:noHBand="0" w:noVBand="1" w:val="04A0"/>
+        <w:tblBorders>
+          <w:top w:val="none" w:sz="0" w:space="0" w:color="auto"/>
+          <w:left w:val="none" w:sz="0" w:space="0" w:color="auto"/>
+          <w:bottom w:val="none" w:sz="0" w:space="0" w:color="auto"/>
+          <w:right w:val="none" w:sz="0" w:space="0" w:color="auto"/>
+          <w:insideH w:val="none" w:sz="0" w:space="0" w:color="auto"/>
+          <w:insideV w:val="none" w:sz="0" w:space="0" w:color="auto"/>
+        </w:tblBorders>
+        <w:tblCellMar>
+          <w:top w:w="80" w:type="dxa"/>
+          <w:left w:w="80" w:type="dxa"/>
+          <w:bottom w:w="80" w:type="dxa"/>
+          <w:right w:w="80" w:type="dxa"/>
+        </w:tblCellMar>
+      </w:tblPr>
+      <w:tblGrid>
+        <w:gridCol w:w="4320"/>
+        <w:gridCol w:w="4320"/>
+      </w:tblGrid>
+      <w:tr>
+        <w:trPr>
+          <w:cantSplit w:val="1"/>
+        </w:trPr>
+        <w:tc>
+          <w:tcPr>
+            <w:tcW w:type="dxa" w:w="4535"/>
+          </w:tcPr>
+          <w:p>
+            <w:pPr>
+              <w:pStyle w:val="Heading1"/>
+            </w:pPr>
+            <w:r>
+              <w:t>Lebenslauf / Profil</w:t>
+            </w:r>
+          </w:p>
+          <w:p>
+            <w:pPr>
+              <w:spacing w:before="120" w:after="0"/>
+            </w:pPr>
+            <w:r>
+              <w:rPr>
+                <w:b/>
+                <w:sz w:val="26"/>
+              </w:rPr>
+              <w:t>{{ person_name }}</w:t>
+            </w:r>
+          </w:p>
+          <w:p>
+            <w:pPr>
+              <w:spacing w:before="0" w:after="0"/>
+            </w:pPr>
+            <w:r>
+              <w:t>{{ person_qualifikation }}</w:t>
+            </w:r>
+          </w:p>
+        </w:tc>
+        <w:tc>
+          <w:tcPr>
+            <w:tcW w:type="dxa" w:w="4819"/>
+          </w:tcPr>
+          <w:p>
+            <w:pPr>
+              <w:spacing w:before="0" w:after="0"/>
+              <w:jc w:val="right"/>
+            </w:pPr>
+            <w:r>
+              <w:t>{{ contact_strasse }}</w:t>
+            </w:r>
+          </w:p>
+          <w:p>
+            <w:pPr>
+              <w:spacing w:before="0" w:after="120"/>
+              <w:jc w:val="right"/>
+            </w:pPr>
+            <w:r>
+              <w:t>{{ contact_plz_ort }}</w:t>
+            </w:r>
+          </w:p>
+          <w:p>
+            <w:pPr>
+              <w:spacing w:before="0" w:after="0"/>
+              <w:jc w:val="right"/>
+            </w:pPr>
+            <w:r>
+              <w:t>{%p if contact_phone %}</w:t>
+            </w:r>
+          </w:p>
+          <w:p>
+            <w:pPr>
+              <w:spacing w:before="0" w:after="0"/>
+              <w:jc w:val="right"/>
+            </w:pPr>
+            <w:r>
+              <w:t>Mobil: {{ contact_phone }}</w:t>
+            </w:r>
+          </w:p>
+          <w:p>
+            <w:pPr>
+              <w:spacing w:before="0" w:after="0"/>
+              <w:jc w:val="right"/>
+            </w:pPr>
+            <w:r>
+              <w:t>{%p endif %}</w:t>
+            </w:r>
+          </w:p>
+          <w:p>
+            <w:pPr>
+              <w:spacing w:before="0" w:after="0"/>
+              <w:jc w:val="right"/>
+            </w:pPr>
+            <w:r>
+              <w:t>{%p if contact_festnetz %}</w:t>
+            </w:r>
+          </w:p>
+          <w:p>
+            <w:pPr>
+              <w:spacing w:before="0" w:after="0"/>
+              <w:jc w:val="right"/>
+            </w:pPr>
+            <w:r>
+              <w:t>Festnetz: {{ contact_festnetz }}</w:t>
+            </w:r>
+          </w:p>
+          <w:p>
+            <w:pPr>
+              <w:spacing w:before="0" w:after="0"/>
+              <w:jc w:val="right"/>
+            </w:pPr>
+            <w:r>
+              <w:t>{%p endif %}</w:t>
+            </w:r>
+          </w:p>
+          <w:p>
+            <w:pPr>
+              <w:spacing w:before="0" w:after="0"/>
+              <w:jc w:val="right"/>
+            </w:pPr>
+            <w:r>
+              <w:t>E-Mail: {{ contact_email }}</w:t>
+            </w:r>
+          </w:p>
+          <w:p>
+            <w:pPr>
+              <w:spacing w:before="0" w:after="0"/>
+              <w:jc w:val="right"/>
+            </w:pPr>
+            <w:r>
+              <w:t>{%p if contact_linkedin %}</w:t>
+            </w:r>
+          </w:p>
+          <w:p>
+            <w:pPr>
+              <w:spacing w:before="0" w:after="0"/>
+              <w:jc w:val="right"/>
+            </w:pPr>
+            <w:r>
+              <w:t>LinkedIn: {{ contact_linkedin }}</w:t>
+            </w:r>
+          </w:p>
+          <w:p>
+            <w:pPr>
+              <w:spacing w:before="0" w:after="0"/>
+              <w:jc w:val="right"/>
+            </w:pPr>
+            <w:r>
+              <w:t>{%p endif %}</w:t>
+            </w:r>
+          </w:p>
+          <w:p>
+            <w:pPr>
+              <w:spacing w:before="0" w:after="0"/>
+              <w:jc w:val="right"/>
+            </w:pPr>
+            <w:r>
+              <w:t>{%p if contact_github %}</w:t>
+            </w:r>
+          </w:p>
+          <w:p>
+            <w:pPr>
+              <w:spacing w:before="0" w:after="0"/>
+              <w:jc w:val="right"/>
+            </w:pPr>
+            <w:r>
+              <w:t>GitHub: {{ contact_github }}</w:t>
+            </w:r>
+          </w:p>
+          <w:p>
+            <w:pPr>
+              <w:spacing w:before="0" w:after="0"/>
+              <w:jc w:val="right"/>
+            </w:pPr>
+            <w:r>
+              <w:t>{%p endif %}</w:t>
+            </w:r>
+          </w:p>
+        </w:tc>
+      </w:tr>
+    </w:tbl>
     <w:p>
       <w:r>
-        <w:t>{{ contact_email }}  |  {{ contact_location }}</w:t>
-      </w:r>
-    </w:p>
-    <w:p>
-      <w:r>
-        <w:t>{%p if contact_phone %}</w:t>
-      </w:r>
-    </w:p>
-    <w:p>
-      <w:r>
-        <w:t>Mobil: {{ contact_phone }}</w:t>
-      </w:r>
-    </w:p>
-    <w:p>
-      <w:r>
-        <w:t>{%p endif %}</w:t>
-      </w:r>
-    </w:p>
-    <w:p>
-      <w:r>
-        <w:t>{%p if contact_festnetz %}</w:t>
-      </w:r>
-    </w:p>
-    <w:p>
-      <w:r>
-        <w:t>Festnetz: {{ contact_festnetz }}</w:t>
-      </w:r>
-    </w:p>
-    <w:p>
-      <w:r>
-        <w:t>{%p endif %}</w:t>
-      </w:r>
-    </w:p>
-    <w:p>
-      <w:r>
-        <w:t>{%p if kurzprofil %}</w:t>
+        <w:t>{%p if kurzprofil_saetze %}</w:t>
       </w:r>
     </w:p>
     <w:p>
@@ -60,7 +219,20 @@
     </w:p>
     <w:p>
       <w:r>
-        <w:t>{{ kurzprofil }}</w:t>
+        <w:t>{%p for satz in kurzprofil_saetze %}</w:t>
+      </w:r>
+    </w:p>
+    <w:p>
+      <w:pPr>
+        <w:spacing w:after="40" w:before="0"/>
+      </w:pPr>
+      <w:r>
+        <w:t>{{ satz }}</w:t>
+      </w:r>
+    </w:p>
+    <w:p>
+      <w:r>
+        <w:t>{%p endfor %}</w:t>
       </w:r>
     </w:p>
     <w:p>
@@ -86,12 +258,21 @@
         <w:tblStyle w:val="TableGrid"/>
         <w:tblW w:type="auto" w:w="0"/>
         <w:tblLook w:firstColumn="1" w:firstRow="1" w:lastColumn="0" w:lastRow="0" w:noHBand="0" w:noVBand="1" w:val="04A0"/>
+        <w:tblCellMar>
+          <w:top w:w="80" w:type="dxa"/>
+          <w:left w:w="80" w:type="dxa"/>
+          <w:bottom w:w="80" w:type="dxa"/>
+          <w:right w:w="80" w:type="dxa"/>
+        </w:tblCellMar>
       </w:tblPr>
       <w:tblGrid>
         <w:gridCol w:w="4320"/>
         <w:gridCol w:w="4320"/>
       </w:tblGrid>
       <w:tr>
+        <w:trPr>
+          <w:cantSplit w:val="1"/>
+        </w:trPr>
         <w:tc>
           <w:tcPr>
             <w:tcW w:type="dxa" w:w="3118"/>
@@ -110,6 +291,9 @@
         </w:tc>
       </w:tr>
       <w:tr>
+        <w:trPr>
+          <w:cantSplit w:val="1"/>
+        </w:trPr>
         <w:tc>
           <w:tcPr>
             <w:tcW w:type="dxa" w:w="3118"/>
@@ -148,6 +332,9 @@
         </w:tc>
       </w:tr>
       <w:tr>
+        <w:trPr>
+          <w:cantSplit w:val="1"/>
+        </w:trPr>
         <w:tc>
           <w:tcPr>
             <w:tcW w:type="dxa" w:w="3118"/>
@@ -189,7 +376,7 @@
         <w:pStyle w:val="Heading3"/>
       </w:pPr>
       <w:r>
-        <w:t>{{ wg.reihenfolge }}. {{ wg.titel }}</w:t>
+        <w:t>{{ wg.titel }}</w:t>
       </w:r>
     </w:p>
     <w:tbl>
@@ -197,15 +384,24 @@
         <w:tblStyle w:val="TableGrid"/>
         <w:tblW w:type="auto" w:w="0"/>
         <w:tblLook w:firstColumn="1" w:firstRow="1" w:lastColumn="0" w:lastRow="0" w:noHBand="0" w:noVBand="1" w:val="04A0"/>
+        <w:tblCellMar>
+          <w:top w:w="80" w:type="dxa"/>
+          <w:left w:w="80" w:type="dxa"/>
+          <w:bottom w:w="80" w:type="dxa"/>
+          <w:right w:w="80" w:type="dxa"/>
+        </w:tblCellMar>
       </w:tblPr>
       <w:tblGrid>
         <w:gridCol w:w="4320"/>
         <w:gridCol w:w="4320"/>
       </w:tblGrid>
       <w:tr>
+        <w:trPr>
+          <w:cantSplit w:val="1"/>
+        </w:trPr>
         <w:tc>
           <w:tcPr>
-            <w:tcW w:type="dxa" w:w="4320"/>
+            <w:tcW w:type="dxa" w:w="3118"/>
           </w:tcPr>
           <w:p>
             <w:r>
@@ -215,15 +411,18 @@
         </w:tc>
         <w:tc>
           <w:tcPr>
-            <w:tcW w:type="dxa" w:w="4320"/>
+            <w:tcW w:type="dxa" w:w="6236"/>
           </w:tcPr>
           <w:p/>
         </w:tc>
       </w:tr>
       <w:tr>
+        <w:trPr>
+          <w:cantSplit w:val="1"/>
+        </w:trPr>
         <w:tc>
           <w:tcPr>
-            <w:tcW w:type="dxa" w:w="4320"/>
+            <w:tcW w:type="dxa" w:w="3118"/>
           </w:tcPr>
           <w:p>
             <w:r>
@@ -233,7 +432,7 @@
         </w:tc>
         <w:tc>
           <w:tcPr>
-            <w:tcW w:type="dxa" w:w="4320"/>
+            <w:tcW w:type="dxa" w:w="6236"/>
           </w:tcPr>
           <w:p>
             <w:r>
@@ -243,9 +442,12 @@
         </w:tc>
       </w:tr>
       <w:tr>
+        <w:trPr>
+          <w:cantSplit w:val="1"/>
+        </w:trPr>
         <w:tc>
           <w:tcPr>
-            <w:tcW w:type="dxa" w:w="4320"/>
+            <w:tcW w:type="dxa" w:w="3118"/>
           </w:tcPr>
           <w:p>
             <w:r>
@@ -255,7 +457,7 @@
         </w:tc>
         <w:tc>
           <w:tcPr>
-            <w:tcW w:type="dxa" w:w="4320"/>
+            <w:tcW w:type="dxa" w:w="6236"/>
           </w:tcPr>
           <w:p/>
         </w:tc>
@@ -264,6 +466,193 @@
     <w:p>
       <w:r>
         <w:t>{%p endfor %}</w:t>
+      </w:r>
+    </w:p>
+    <w:p>
+      <w:r>
+        <w:t>{%p if werdegang %}</w:t>
+      </w:r>
+    </w:p>
+    <w:p>
+      <w:r>
+        <w:br w:type="page"/>
+      </w:r>
+    </w:p>
+    <w:p>
+      <w:pPr>
+        <w:pStyle w:val="Heading2"/>
+      </w:pPr>
+      <w:r>
+        <w:t>Beruflicher Werdegang</w:t>
+      </w:r>
+    </w:p>
+    <w:tbl>
+      <w:tblPr>
+        <w:tblStyle w:val="TableGrid"/>
+        <w:tblW w:type="auto" w:w="0"/>
+        <w:tblLook w:firstColumn="1" w:firstRow="1" w:lastColumn="0" w:lastRow="0" w:noHBand="0" w:noVBand="1" w:val="04A0"/>
+        <w:tblCellMar>
+          <w:top w:w="80" w:type="dxa"/>
+          <w:left w:w="80" w:type="dxa"/>
+          <w:bottom w:w="80" w:type="dxa"/>
+          <w:right w:w="80" w:type="dxa"/>
+        </w:tblCellMar>
+      </w:tblPr>
+      <w:tblGrid>
+        <w:gridCol w:w="2880"/>
+        <w:gridCol w:w="2880"/>
+        <w:gridCol w:w="2880"/>
+      </w:tblGrid>
+      <w:tr>
+        <w:trPr>
+          <w:cantSplit w:val="1"/>
+        </w:trPr>
+        <w:tc>
+          <w:tcPr>
+            <w:tcW w:type="dxa" w:w="1701"/>
+          </w:tcPr>
+          <w:p>
+            <w:r>
+              <w:rPr>
+                <w:b/>
+              </w:rPr>
+              <w:t>Zeitraum</w:t>
+            </w:r>
+          </w:p>
+        </w:tc>
+        <w:tc>
+          <w:tcPr>
+            <w:tcW w:type="dxa" w:w="4819"/>
+          </w:tcPr>
+          <w:p>
+            <w:r>
+              <w:rPr>
+                <w:b/>
+              </w:rPr>
+              <w:t>Position</w:t>
+            </w:r>
+          </w:p>
+        </w:tc>
+        <w:tc>
+          <w:tcPr>
+            <w:tcW w:type="dxa" w:w="2835"/>
+          </w:tcPr>
+          <w:p>
+            <w:r>
+              <w:rPr>
+                <w:b/>
+              </w:rPr>
+              <w:t>Arbeitgeber</w:t>
+            </w:r>
+          </w:p>
+        </w:tc>
+      </w:tr>
+      <w:tr>
+        <w:trPr>
+          <w:cantSplit w:val="1"/>
+        </w:trPr>
+        <w:tc>
+          <w:tcPr>
+            <w:tcW w:type="dxa" w:w="1701"/>
+          </w:tcPr>
+          <w:p>
+            <w:r>
+              <w:t>{%tr for w in werdegang %}</w:t>
+            </w:r>
+          </w:p>
+        </w:tc>
+        <w:tc>
+          <w:tcPr>
+            <w:tcW w:type="dxa" w:w="4819"/>
+          </w:tcPr>
+          <w:p/>
+        </w:tc>
+        <w:tc>
+          <w:tcPr>
+            <w:tcW w:type="dxa" w:w="2835"/>
+          </w:tcPr>
+          <w:p/>
+        </w:tc>
+      </w:tr>
+      <w:tr>
+        <w:trPr>
+          <w:cantSplit w:val="1"/>
+        </w:trPr>
+        <w:tc>
+          <w:tcPr>
+            <w:tcW w:type="dxa" w:w="1701"/>
+          </w:tcPr>
+          <w:p>
+            <w:r>
+              <w:t>{{ w.start }}–{{ w.end }}</w:t>
+            </w:r>
+          </w:p>
+        </w:tc>
+        <w:tc>
+          <w:tcPr>
+            <w:tcW w:type="dxa" w:w="4819"/>
+          </w:tcPr>
+          <w:p>
+            <w:pPr>
+              <w:spacing w:after="120"/>
+            </w:pPr>
+            <w:r>
+              <w:t>{{ w.titel }}</w:t>
+            </w:r>
+          </w:p>
+          <w:p>
+            <w:r>
+              <w:t>{{ w.beschreibung }}</w:t>
+            </w:r>
+          </w:p>
+        </w:tc>
+        <w:tc>
+          <w:tcPr>
+            <w:tcW w:type="dxa" w:w="2835"/>
+          </w:tcPr>
+          <w:p>
+            <w:r>
+              <w:t>{{ w.arbeitgeber }}</w:t>
+            </w:r>
+          </w:p>
+        </w:tc>
+      </w:tr>
+      <w:tr>
+        <w:trPr>
+          <w:cantSplit w:val="1"/>
+        </w:trPr>
+        <w:tc>
+          <w:tcPr>
+            <w:tcW w:type="dxa" w:w="1701"/>
+          </w:tcPr>
+          <w:p>
+            <w:r>
+              <w:t>{%tr endfor %}</w:t>
+            </w:r>
+          </w:p>
+        </w:tc>
+        <w:tc>
+          <w:tcPr>
+            <w:tcW w:type="dxa" w:w="4819"/>
+          </w:tcPr>
+          <w:p/>
+        </w:tc>
+        <w:tc>
+          <w:tcPr>
+            <w:tcW w:type="dxa" w:w="2835"/>
+          </w:tcPr>
+          <w:p/>
+        </w:tc>
+      </w:tr>
+    </w:tbl>
+    <w:p>
+      <w:r>
+        <w:t>{%p endif %}</w:t>
+      </w:r>
+    </w:p>
+    <w:p>
+      <w:r>
+        <w:br w:type="page"/>
       </w:r>
     </w:p>
     <w:p>
@@ -279,16 +668,24 @@
         <w:tblStyle w:val="TableGrid"/>
         <w:tblW w:type="auto" w:w="0"/>
         <w:tblLook w:firstColumn="1" w:firstRow="1" w:lastColumn="0" w:lastRow="0" w:noHBand="0" w:noVBand="1" w:val="04A0"/>
+        <w:tblCellMar>
+          <w:top w:w="80" w:type="dxa"/>
+          <w:left w:w="80" w:type="dxa"/>
+          <w:bottom w:w="80" w:type="dxa"/>
+          <w:right w:w="80" w:type="dxa"/>
+        </w:tblCellMar>
       </w:tblPr>
       <w:tblGrid>
-        <w:gridCol w:w="2880"/>
-        <w:gridCol w:w="2880"/>
-        <w:gridCol w:w="2880"/>
+        <w:gridCol w:w="4320"/>
+        <w:gridCol w:w="4320"/>
       </w:tblGrid>
       <w:tr>
+        <w:trPr>
+          <w:cantSplit w:val="1"/>
+        </w:trPr>
         <w:tc>
           <w:tcPr>
-            <w:tcW w:type="dxa" w:w="2880"/>
+            <w:tcW w:type="dxa" w:w="3118"/>
           </w:tcPr>
           <w:p>
             <w:r>
@@ -301,7 +698,7 @@
         </w:tc>
         <w:tc>
           <w:tcPr>
-            <w:tcW w:type="dxa" w:w="2880"/>
+            <w:tcW w:type="dxa" w:w="6236"/>
           </w:tcPr>
           <w:p>
             <w:r>
@@ -312,24 +709,14 @@
             </w:r>
           </w:p>
         </w:tc>
+      </w:tr>
+      <w:tr>
+        <w:trPr>
+          <w:cantSplit w:val="1"/>
+        </w:trPr>
         <w:tc>
           <w:tcPr>
-            <w:tcW w:type="dxa" w:w="2880"/>
-          </w:tcPr>
-          <w:p>
-            <w:r>
-              <w:rPr>
-                <w:b/>
-              </w:rPr>
-              <w:t>Wissensgebiete</w:t>
-            </w:r>
-          </w:p>
-        </w:tc>
-      </w:tr>
-      <w:tr>
-        <w:tc>
-          <w:tcPr>
-            <w:tcW w:type="dxa" w:w="2880"/>
+            <w:tcW w:type="dxa" w:w="3118"/>
           </w:tcPr>
           <w:p>
             <w:r>
@@ -339,21 +726,18 @@
         </w:tc>
         <w:tc>
           <w:tcPr>
-            <w:tcW w:type="dxa" w:w="2880"/>
-          </w:tcPr>
-          <w:p/>
-        </w:tc>
-        <w:tc>
-          <w:tcPr>
-            <w:tcW w:type="dxa" w:w="2880"/>
+            <w:tcW w:type="dxa" w:w="6236"/>
           </w:tcPr>
           <w:p/>
         </w:tc>
       </w:tr>
       <w:tr>
+        <w:trPr>
+          <w:cantSplit w:val="1"/>
+        </w:trPr>
         <w:tc>
           <w:tcPr>
-            <w:tcW w:type="dxa" w:w="2880"/>
+            <w:tcW w:type="dxa" w:w="3118"/>
           </w:tcPr>
           <w:p>
             <w:r>
@@ -373,7 +757,7 @@
         </w:tc>
         <w:tc>
           <w:tcPr>
-            <w:tcW w:type="dxa" w:w="2880"/>
+            <w:tcW w:type="dxa" w:w="6236"/>
           </w:tcPr>
           <w:p>
             <w:r>
@@ -391,21 +775,14 @@
             </w:r>
           </w:p>
         </w:tc>
+      </w:tr>
+      <w:tr>
+        <w:trPr>
+          <w:cantSplit w:val="1"/>
+        </w:trPr>
         <w:tc>
           <w:tcPr>
-            <w:tcW w:type="dxa" w:w="2880"/>
-          </w:tcPr>
-          <w:p>
-            <w:r>
-              <w:t>{{ p.tech_str }}</w:t>
-            </w:r>
-          </w:p>
-        </w:tc>
-      </w:tr>
-      <w:tr>
-        <w:tc>
-          <w:tcPr>
-            <w:tcW w:type="dxa" w:w="2880"/>
+            <w:tcW w:type="dxa" w:w="3118"/>
           </w:tcPr>
           <w:p>
             <w:r>
@@ -415,13 +792,7 @@
         </w:tc>
         <w:tc>
           <w:tcPr>
-            <w:tcW w:type="dxa" w:w="2880"/>
-          </w:tcPr>
-          <w:p/>
-        </w:tc>
-        <w:tc>
-          <w:tcPr>
-            <w:tcW w:type="dxa" w:w="2880"/>
+            <w:tcW w:type="dxa" w:w="6236"/>
           </w:tcPr>
           <w:p/>
         </w:tc>
@@ -429,158 +800,7 @@
     </w:tbl>
     <w:p>
       <w:r>
-        <w:t>{%p if werdegang %}</w:t>
-      </w:r>
-    </w:p>
-    <w:p>
-      <w:pPr>
-        <w:pStyle w:val="Heading2"/>
-      </w:pPr>
-      <w:r>
-        <w:t>Beruflicher Werdegang</w:t>
-      </w:r>
-    </w:p>
-    <w:tbl>
-      <w:tblPr>
-        <w:tblStyle w:val="TableGrid"/>
-        <w:tblW w:type="auto" w:w="0"/>
-        <w:tblLook w:firstColumn="1" w:firstRow="1" w:lastColumn="0" w:lastRow="0" w:noHBand="0" w:noVBand="1" w:val="04A0"/>
-      </w:tblPr>
-      <w:tblGrid>
-        <w:gridCol w:w="2880"/>
-        <w:gridCol w:w="2880"/>
-        <w:gridCol w:w="2880"/>
-      </w:tblGrid>
-      <w:tr>
-        <w:tc>
-          <w:tcPr>
-            <w:tcW w:type="dxa" w:w="2880"/>
-          </w:tcPr>
-          <w:p>
-            <w:r>
-              <w:rPr>
-                <w:b/>
-              </w:rPr>
-              <w:t>Zeitraum</w:t>
-            </w:r>
-          </w:p>
-        </w:tc>
-        <w:tc>
-          <w:tcPr>
-            <w:tcW w:type="dxa" w:w="2880"/>
-          </w:tcPr>
-          <w:p>
-            <w:r>
-              <w:rPr>
-                <w:b/>
-              </w:rPr>
-              <w:t>Position</w:t>
-            </w:r>
-          </w:p>
-        </w:tc>
-        <w:tc>
-          <w:tcPr>
-            <w:tcW w:type="dxa" w:w="2880"/>
-          </w:tcPr>
-          <w:p>
-            <w:r>
-              <w:rPr>
-                <w:b/>
-              </w:rPr>
-              <w:t>Arbeitgeber</w:t>
-            </w:r>
-          </w:p>
-        </w:tc>
-      </w:tr>
-      <w:tr>
-        <w:tc>
-          <w:tcPr>
-            <w:tcW w:type="dxa" w:w="2880"/>
-          </w:tcPr>
-          <w:p>
-            <w:r>
-              <w:t>{%tr for w in werdegang %}</w:t>
-            </w:r>
-          </w:p>
-        </w:tc>
-        <w:tc>
-          <w:tcPr>
-            <w:tcW w:type="dxa" w:w="2880"/>
-          </w:tcPr>
-          <w:p/>
-        </w:tc>
-        <w:tc>
-          <w:tcPr>
-            <w:tcW w:type="dxa" w:w="2880"/>
-          </w:tcPr>
-          <w:p/>
-        </w:tc>
-      </w:tr>
-      <w:tr>
-        <w:tc>
-          <w:tcPr>
-            <w:tcW w:type="dxa" w:w="2880"/>
-          </w:tcPr>
-          <w:p>
-            <w:r>
-              <w:t>{{ w.start }}–{{ w.end }}</w:t>
-            </w:r>
-          </w:p>
-        </w:tc>
-        <w:tc>
-          <w:tcPr>
-            <w:tcW w:type="dxa" w:w="2880"/>
-          </w:tcPr>
-          <w:p>
-            <w:r>
-              <w:t>{{ w.titel }}</w:t>
-            </w:r>
-          </w:p>
-          <w:p>
-            <w:r>
-              <w:t>{{ w.beschreibung }}</w:t>
-            </w:r>
-          </w:p>
-        </w:tc>
-        <w:tc>
-          <w:tcPr>
-            <w:tcW w:type="dxa" w:w="2880"/>
-          </w:tcPr>
-          <w:p>
-            <w:r>
-              <w:t>{{ w.arbeitgeber }}</w:t>
-            </w:r>
-          </w:p>
-        </w:tc>
-      </w:tr>
-      <w:tr>
-        <w:tc>
-          <w:tcPr>
-            <w:tcW w:type="dxa" w:w="2880"/>
-          </w:tcPr>
-          <w:p>
-            <w:r>
-              <w:t>{%tr endfor %}</w:t>
-            </w:r>
-          </w:p>
-        </w:tc>
-        <w:tc>
-          <w:tcPr>
-            <w:tcW w:type="dxa" w:w="2880"/>
-          </w:tcPr>
-          <w:p/>
-        </w:tc>
-        <w:tc>
-          <w:tcPr>
-            <w:tcW w:type="dxa" w:w="2880"/>
-          </w:tcPr>
-          <w:p/>
-        </w:tc>
-      </w:tr>
-    </w:tbl>
-    <w:p>
-      <w:r>
-        <w:t>{%p endif %}</w:t>
+        <w:br w:type="page"/>
       </w:r>
     </w:p>
     <w:p>
@@ -596,6 +816,12 @@
         <w:tblStyle w:val="TableGrid"/>
         <w:tblW w:type="auto" w:w="0"/>
         <w:tblLook w:firstColumn="1" w:firstRow="1" w:lastColumn="0" w:lastRow="0" w:noHBand="0" w:noVBand="1" w:val="04A0"/>
+        <w:tblCellMar>
+          <w:top w:w="80" w:type="dxa"/>
+          <w:left w:w="80" w:type="dxa"/>
+          <w:bottom w:w="80" w:type="dxa"/>
+          <w:right w:w="80" w:type="dxa"/>
+        </w:tblCellMar>
       </w:tblPr>
       <w:tblGrid>
         <w:gridCol w:w="2880"/>
@@ -603,6 +829,9 @@
         <w:gridCol w:w="2880"/>
       </w:tblGrid>
       <w:tr>
+        <w:trPr>
+          <w:cantSplit w:val="1"/>
+        </w:trPr>
         <w:tc>
           <w:tcPr>
             <w:tcW w:type="dxa" w:w="2880"/>
@@ -644,6 +873,9 @@
         </w:tc>
       </w:tr>
       <w:tr>
+        <w:trPr>
+          <w:cantSplit w:val="1"/>
+        </w:trPr>
         <w:tc>
           <w:tcPr>
             <w:tcW w:type="dxa" w:w="2880"/>
@@ -668,13 +900,16 @@
         </w:tc>
       </w:tr>
       <w:tr>
+        <w:trPr>
+          <w:cantSplit w:val="1"/>
+        </w:trPr>
         <w:tc>
           <w:tcPr>
             <w:tcW w:type="dxa" w:w="2880"/>
           </w:tcPr>
           <w:p>
             <w:r>
-              <w:t>{{ a.start }}–{{ a.end }}</w:t>
+              <w:t>{{ a.periode }}</w:t>
             </w:r>
           </w:p>
         </w:tc>
@@ -705,6 +940,9 @@
         </w:tc>
       </w:tr>
       <w:tr>
+        <w:trPr>
+          <w:cantSplit w:val="1"/>
+        </w:trPr>
         <w:tc>
           <w:tcPr>
             <w:tcW w:type="dxa" w:w="2880"/>
@@ -739,7 +977,7 @@
         <w:pStyle w:val="Heading2"/>
       </w:pPr>
       <w:r>
-        <w:t>Zertifikate</w:t>
+        <w:t>Fortbildung</w:t>
       </w:r>
     </w:p>
     <w:tbl>
@@ -747,6 +985,12 @@
         <w:tblStyle w:val="TableGrid"/>
         <w:tblW w:type="auto" w:w="0"/>
         <w:tblLook w:firstColumn="1" w:firstRow="1" w:lastColumn="0" w:lastRow="0" w:noHBand="0" w:noVBand="1" w:val="04A0"/>
+        <w:tblCellMar>
+          <w:top w:w="80" w:type="dxa"/>
+          <w:left w:w="80" w:type="dxa"/>
+          <w:bottom w:w="80" w:type="dxa"/>
+          <w:right w:w="80" w:type="dxa"/>
+        </w:tblCellMar>
       </w:tblPr>
       <w:tblGrid>
         <w:gridCol w:w="2880"/>
@@ -754,6 +998,9 @@
         <w:gridCol w:w="2880"/>
       </w:tblGrid>
       <w:tr>
+        <w:trPr>
+          <w:cantSplit w:val="1"/>
+        </w:trPr>
         <w:tc>
           <w:tcPr>
             <w:tcW w:type="dxa" w:w="2880"/>
@@ -795,6 +1042,9 @@
         </w:tc>
       </w:tr>
       <w:tr>
+        <w:trPr>
+          <w:cantSplit w:val="1"/>
+        </w:trPr>
         <w:tc>
           <w:tcPr>
             <w:tcW w:type="dxa" w:w="2880"/>
@@ -819,6 +1069,9 @@
         </w:tc>
       </w:tr>
       <w:tr>
+        <w:trPr>
+          <w:cantSplit w:val="1"/>
+        </w:trPr>
         <w:tc>
           <w:tcPr>
             <w:tcW w:type="dxa" w:w="2880"/>
@@ -851,6 +1104,9 @@
         </w:tc>
       </w:tr>
       <w:tr>
+        <w:trPr>
+          <w:cantSplit w:val="1"/>
+        </w:trPr>
         <w:tc>
           <w:tcPr>
             <w:tcW w:type="dxa" w:w="2880"/>
@@ -886,6 +1142,11 @@
       </w:r>
     </w:p>
     <w:p>
+      <w:r>
+        <w:br w:type="page"/>
+      </w:r>
+    </w:p>
+    <w:p>
       <w:pPr>
         <w:pStyle w:val="Heading2"/>
       </w:pPr>
@@ -898,15 +1159,24 @@
         <w:tblStyle w:val="TableGrid"/>
         <w:tblW w:type="auto" w:w="0"/>
         <w:tblLook w:firstColumn="1" w:firstRow="1" w:lastColumn="0" w:lastRow="0" w:noHBand="0" w:noVBand="1" w:val="04A0"/>
+        <w:tblCellMar>
+          <w:top w:w="80" w:type="dxa"/>
+          <w:left w:w="80" w:type="dxa"/>
+          <w:bottom w:w="80" w:type="dxa"/>
+          <w:right w:w="80" w:type="dxa"/>
+        </w:tblCellMar>
       </w:tblPr>
       <w:tblGrid>
         <w:gridCol w:w="4320"/>
         <w:gridCol w:w="4320"/>
       </w:tblGrid>
       <w:tr>
+        <w:trPr>
+          <w:cantSplit w:val="1"/>
+        </w:trPr>
         <w:tc>
           <w:tcPr>
-            <w:tcW w:type="dxa" w:w="4320"/>
+            <w:tcW w:type="dxa" w:w="3118"/>
           </w:tcPr>
           <w:p>
             <w:r>
@@ -919,7 +1189,7 @@
         </w:tc>
         <w:tc>
           <w:tcPr>
-            <w:tcW w:type="dxa" w:w="4320"/>
+            <w:tcW w:type="dxa" w:w="6236"/>
           </w:tcPr>
           <w:p>
             <w:r>
@@ -932,9 +1202,12 @@
         </w:tc>
       </w:tr>
       <w:tr>
+        <w:trPr>
+          <w:cantSplit w:val="1"/>
+        </w:trPr>
         <w:tc>
           <w:tcPr>
-            <w:tcW w:type="dxa" w:w="4320"/>
+            <w:tcW w:type="dxa" w:w="3118"/>
           </w:tcPr>
           <w:p>
             <w:r>
@@ -944,15 +1217,18 @@
         </w:tc>
         <w:tc>
           <w:tcPr>
-            <w:tcW w:type="dxa" w:w="4320"/>
+            <w:tcW w:type="dxa" w:w="6236"/>
           </w:tcPr>
           <w:p/>
         </w:tc>
       </w:tr>
       <w:tr>
+        <w:trPr>
+          <w:cantSplit w:val="1"/>
+        </w:trPr>
         <w:tc>
           <w:tcPr>
-            <w:tcW w:type="dxa" w:w="4320"/>
+            <w:tcW w:type="dxa" w:w="3118"/>
           </w:tcPr>
           <w:p>
             <w:r>
@@ -962,7 +1238,7 @@
         </w:tc>
         <w:tc>
           <w:tcPr>
-            <w:tcW w:type="dxa" w:w="4320"/>
+            <w:tcW w:type="dxa" w:w="6236"/>
           </w:tcPr>
           <w:p>
             <w:r>
@@ -972,9 +1248,12 @@
         </w:tc>
       </w:tr>
       <w:tr>
+        <w:trPr>
+          <w:cantSplit w:val="1"/>
+        </w:trPr>
         <w:tc>
           <w:tcPr>
-            <w:tcW w:type="dxa" w:w="4320"/>
+            <w:tcW w:type="dxa" w:w="3118"/>
           </w:tcPr>
           <w:p>
             <w:r>
@@ -984,7 +1263,145 @@
         </w:tc>
         <w:tc>
           <w:tcPr>
-            <w:tcW w:type="dxa" w:w="4320"/>
+            <w:tcW w:type="dxa" w:w="6236"/>
+          </w:tcPr>
+          <w:p/>
+        </w:tc>
+      </w:tr>
+    </w:tbl>
+    <w:p>
+      <w:r>
+        <w:t>{%p endif %}</w:t>
+      </w:r>
+    </w:p>
+    <w:p>
+      <w:r>
+        <w:t>{%p if publikationen %}</w:t>
+      </w:r>
+    </w:p>
+    <w:p>
+      <w:pPr>
+        <w:pStyle w:val="Heading2"/>
+      </w:pPr>
+      <w:r>
+        <w:t>Publikationen</w:t>
+      </w:r>
+    </w:p>
+    <w:tbl>
+      <w:tblPr>
+        <w:tblStyle w:val="TableGrid"/>
+        <w:tblW w:type="auto" w:w="0"/>
+        <w:tblLook w:firstColumn="1" w:firstRow="1" w:lastColumn="0" w:lastRow="0" w:noHBand="0" w:noVBand="1" w:val="04A0"/>
+        <w:tblCellMar>
+          <w:top w:w="80" w:type="dxa"/>
+          <w:left w:w="80" w:type="dxa"/>
+          <w:bottom w:w="80" w:type="dxa"/>
+          <w:right w:w="80" w:type="dxa"/>
+        </w:tblCellMar>
+      </w:tblPr>
+      <w:tblGrid>
+        <w:gridCol w:w="4320"/>
+        <w:gridCol w:w="4320"/>
+      </w:tblGrid>
+      <w:tr>
+        <w:trPr>
+          <w:cantSplit w:val="1"/>
+        </w:trPr>
+        <w:tc>
+          <w:tcPr>
+            <w:tcW w:type="dxa" w:w="1134"/>
+          </w:tcPr>
+          <w:p>
+            <w:r>
+              <w:rPr>
+                <w:b/>
+              </w:rPr>
+              <w:t>Jahr</w:t>
+            </w:r>
+          </w:p>
+        </w:tc>
+        <w:tc>
+          <w:tcPr>
+            <w:tcW w:type="dxa" w:w="8220"/>
+          </w:tcPr>
+          <w:p>
+            <w:r>
+              <w:rPr>
+                <w:b/>
+              </w:rPr>
+              <w:t>Titel</w:t>
+            </w:r>
+          </w:p>
+        </w:tc>
+      </w:tr>
+      <w:tr>
+        <w:trPr>
+          <w:cantSplit w:val="1"/>
+        </w:trPr>
+        <w:tc>
+          <w:tcPr>
+            <w:tcW w:type="dxa" w:w="1134"/>
+          </w:tcPr>
+          <w:p>
+            <w:r>
+              <w:t>{%tr for pub in publikationen %}</w:t>
+            </w:r>
+          </w:p>
+        </w:tc>
+        <w:tc>
+          <w:tcPr>
+            <w:tcW w:type="dxa" w:w="8220"/>
+          </w:tcPr>
+          <w:p/>
+        </w:tc>
+      </w:tr>
+      <w:tr>
+        <w:trPr>
+          <w:cantSplit w:val="1"/>
+        </w:trPr>
+        <w:tc>
+          <w:tcPr>
+            <w:tcW w:type="dxa" w:w="1134"/>
+          </w:tcPr>
+          <w:p>
+            <w:r>
+              <w:t>{{ pub.jahr }}</w:t>
+            </w:r>
+          </w:p>
+        </w:tc>
+        <w:tc>
+          <w:tcPr>
+            <w:tcW w:type="dxa" w:w="8220"/>
+          </w:tcPr>
+          <w:p>
+            <w:r>
+              <w:t>{{ pub.titel }}</w:t>
+            </w:r>
+          </w:p>
+          <w:p>
+            <w:r>
+              <w:t>{{ pub.beschreibung }}</w:t>
+            </w:r>
+          </w:p>
+        </w:tc>
+      </w:tr>
+      <w:tr>
+        <w:trPr>
+          <w:cantSplit w:val="1"/>
+        </w:trPr>
+        <w:tc>
+          <w:tcPr>
+            <w:tcW w:type="dxa" w:w="1134"/>
+          </w:tcPr>
+          <w:p>
+            <w:r>
+              <w:t>{%tr endfor %}</w:t>
+            </w:r>
+          </w:p>
+        </w:tc>
+        <w:tc>
+          <w:tcPr>
+            <w:tcW w:type="dxa" w:w="8220"/>
           </w:tcPr>
           <w:p/>
         </w:tc>
@@ -1013,11 +1430,20 @@
         <w:tblStyle w:val="TableGrid"/>
         <w:tblW w:type="auto" w:w="0"/>
         <w:tblLook w:firstColumn="1" w:firstRow="1" w:lastColumn="0" w:lastRow="0" w:noHBand="0" w:noVBand="1" w:val="04A0"/>
+        <w:tblCellMar>
+          <w:top w:w="80" w:type="dxa"/>
+          <w:left w:w="80" w:type="dxa"/>
+          <w:bottom w:w="80" w:type="dxa"/>
+          <w:right w:w="80" w:type="dxa"/>
+        </w:tblCellMar>
       </w:tblPr>
       <w:tblGrid>
         <w:gridCol w:w="8640"/>
       </w:tblGrid>
       <w:tr>
+        <w:trPr>
+          <w:cantSplit w:val="1"/>
+        </w:trPr>
         <w:tc>
           <w:tcPr>
             <w:tcW w:type="dxa" w:w="8640"/>
@@ -1030,6 +1456,9 @@
         </w:tc>
       </w:tr>
       <w:tr>
+        <w:trPr>
+          <w:cantSplit w:val="1"/>
+        </w:trPr>
         <w:tc>
           <w:tcPr>
             <w:tcW w:type="dxa" w:w="8640"/>
@@ -1042,6 +1471,9 @@
         </w:tc>
       </w:tr>
       <w:tr>
+        <w:trPr>
+          <w:cantSplit w:val="1"/>
+        </w:trPr>
         <w:tc>
           <w:tcPr>
             <w:tcW w:type="dxa" w:w="8640"/>
@@ -1061,7 +1493,7 @@
     </w:p>
     <w:p>
       <w:r>
-        <w:t>{%p if persoenliche_daten %}</w:t>
+        <w:t>{%p if persoenliche_daten_liste %}</w:t>
       </w:r>
     </w:p>
     <w:p>
@@ -1077,31 +1509,82 @@
         <w:tblStyle w:val="TableGrid"/>
         <w:tblW w:type="auto" w:w="0"/>
         <w:tblLook w:firstColumn="1" w:firstRow="1" w:lastColumn="0" w:lastRow="0" w:noHBand="0" w:noVBand="1" w:val="04A0"/>
+        <w:tblCellMar>
+          <w:top w:w="80" w:type="dxa"/>
+          <w:left w:w="80" w:type="dxa"/>
+          <w:bottom w:w="80" w:type="dxa"/>
+          <w:right w:w="80" w:type="dxa"/>
+        </w:tblCellMar>
       </w:tblPr>
       <w:tblGrid>
         <w:gridCol w:w="4320"/>
         <w:gridCol w:w="4320"/>
       </w:tblGrid>
       <w:tr>
+        <w:trPr>
+          <w:cantSplit w:val="1"/>
+        </w:trPr>
         <w:tc>
           <w:tcPr>
-            <w:tcW w:type="dxa" w:w="4320"/>
+            <w:tcW w:type="dxa" w:w="3118"/>
           </w:tcPr>
           <w:p>
             <w:r>
-              <w:t>{{ persoenliche_daten.label }}</w:t>
+              <w:t>{%tr for pd in persoenliche_daten_liste %}</w:t>
             </w:r>
           </w:p>
         </w:tc>
         <w:tc>
           <w:tcPr>
-            <w:tcW w:type="dxa" w:w="4320"/>
+            <w:tcW w:type="dxa" w:w="6236"/>
+          </w:tcPr>
+          <w:p/>
+        </w:tc>
+      </w:tr>
+      <w:tr>
+        <w:trPr>
+          <w:cantSplit w:val="1"/>
+        </w:trPr>
+        <w:tc>
+          <w:tcPr>
+            <w:tcW w:type="dxa" w:w="3118"/>
           </w:tcPr>
           <w:p>
             <w:r>
-              <w:t>{{ persoenliche_daten.value }}</w:t>
+              <w:t>{{ pd.label }}</w:t>
             </w:r>
           </w:p>
+        </w:tc>
+        <w:tc>
+          <w:tcPr>
+            <w:tcW w:type="dxa" w:w="6236"/>
+          </w:tcPr>
+          <w:p>
+            <w:r>
+              <w:t>{{ pd.value }}</w:t>
+            </w:r>
+          </w:p>
+        </w:tc>
+      </w:tr>
+      <w:tr>
+        <w:trPr>
+          <w:cantSplit w:val="1"/>
+        </w:trPr>
+        <w:tc>
+          <w:tcPr>
+            <w:tcW w:type="dxa" w:w="3118"/>
+          </w:tcPr>
+          <w:p>
+            <w:r>
+              <w:t>{%tr endfor %}</w:t>
+            </w:r>
+          </w:p>
+        </w:tc>
+        <w:tc>
+          <w:tcPr>
+            <w:tcW w:type="dxa" w:w="6236"/>
+          </w:tcPr>
+          <w:p/>
         </w:tc>
       </w:tr>
     </w:tbl>
@@ -1111,13 +1594,130 @@
       </w:r>
     </w:p>
     <w:sectPr>
+      <w:headerReference w:type="default" r:id="rId9"/>
+      <w:footerReference w:type="default" r:id="rId10"/>
       <w:pgSz w:w="12240" w:h="15840"/>
-      <w:pgMar w:top="1440" w:right="1800" w:bottom="1440" w:left="1800" w:header="720" w:footer="720" w:gutter="0"/>
+      <w:pgMar w:top="1134" w:right="1417" w:bottom="1134" w:left="1417" w:header="454" w:footer="454" w:gutter="0"/>
       <w:cols w:space="720"/>
+      <w:titlePg/>
       <w:docGrid w:linePitch="360"/>
     </w:sectPr>
   </w:body>
 </w:document>
+</file>
+
+<file path=word/footer1.xml><?xml version="1.0" encoding="utf-8"?>
+<w:ftr xmlns:m="http://schemas.openxmlformats.org/officeDocument/2006/math" xmlns:mc="http://schemas.openxmlformats.org/markup-compatibility/2006" xmlns:mo="http://schemas.microsoft.com/office/mac/office/2008/main" xmlns:mv="urn:schemas-microsoft-com:mac:vml" xmlns:o="urn:schemas-microsoft-com:office:office" xmlns:r="http://schemas.openxmlformats.org/officeDocument/2006/relationships" xmlns:v="urn:schemas-microsoft-com:vml" xmlns:w10="urn:schemas-microsoft-com:office:word" xmlns:w14="http://schemas.microsoft.com/office/word/2010/wordml" xmlns:w="http://schemas.openxmlformats.org/wordprocessingml/2006/main" xmlns:wne="http://schemas.microsoft.com/office/word/2006/wordml" xmlns:wp14="http://schemas.microsoft.com/office/word/2010/wordprocessingDrawing" xmlns:wp="http://schemas.openxmlformats.org/drawingml/2006/wordprocessingDrawing" xmlns:wpc="http://schemas.microsoft.com/office/word/2010/wordprocessingCanvas" xmlns:wpg="http://schemas.microsoft.com/office/word/2010/wordprocessingGroup" xmlns:wpi="http://schemas.microsoft.com/office/word/2010/wordprocessingInk" xmlns:wps="http://schemas.microsoft.com/office/word/2010/wordprocessingShape" mc:Ignorable="w14 wp14">
+  <w:p>
+    <w:pPr>
+      <w:pStyle w:val="Footer"/>
+    </w:pPr>
+  </w:p>
+  <w:tbl>
+    <w:tblPr>
+      <w:tblW w:type="auto" w:w="0"/>
+      <w:tblLook w:firstColumn="1" w:firstRow="1" w:lastColumn="0" w:lastRow="0" w:noHBand="0" w:noVBand="1" w:val="04A0"/>
+      <w:tblBorders>
+        <w:top w:val="none" w:sz="0" w:space="0" w:color="auto"/>
+        <w:left w:val="none" w:sz="0" w:space="0" w:color="auto"/>
+        <w:bottom w:val="none" w:sz="0" w:space="0" w:color="auto"/>
+        <w:right w:val="none" w:sz="0" w:space="0" w:color="auto"/>
+        <w:insideH w:val="none" w:sz="0" w:space="0" w:color="auto"/>
+        <w:insideV w:val="none" w:sz="0" w:space="0" w:color="auto"/>
+      </w:tblBorders>
+    </w:tblPr>
+    <w:tblGrid>
+      <w:gridCol w:w="3118"/>
+      <w:gridCol w:w="3118"/>
+      <w:gridCol w:w="3118"/>
+    </w:tblGrid>
+    <w:tr>
+      <w:tc>
+        <w:tcPr>
+          <w:tcW w:type="dxa" w:w="3402"/>
+        </w:tcPr>
+        <w:p>
+          <w:pPr>
+            <w:spacing w:before="0"/>
+          </w:pPr>
+          <w:r>
+            <w:t>{{ today_date }}</w:t>
+          </w:r>
+        </w:p>
+      </w:tc>
+      <w:tc>
+        <w:tcPr>
+          <w:tcW w:type="dxa" w:w="2551"/>
+        </w:tcPr>
+        <w:p>
+          <w:pPr>
+            <w:jc w:val="center"/>
+          </w:pPr>
+          <w:r>
+            <w:t>Version: {{ filename }}</w:t>
+          </w:r>
+        </w:p>
+      </w:tc>
+      <w:tc>
+        <w:tcPr>
+          <w:tcW w:type="dxa" w:w="3402"/>
+        </w:tcPr>
+        <w:p>
+          <w:pPr>
+            <w:jc w:val="right"/>
+          </w:pPr>
+          <w:r>
+            <w:t xml:space="preserve">Seite </w:t>
+          </w:r>
+          <w:r>
+            <w:fldChar w:fldCharType="begin"/>
+          </w:r>
+          <w:r>
+            <w:instrText xml:space="preserve"> PAGE </w:instrText>
+          </w:r>
+          <w:r>
+            <w:fldChar w:fldCharType="end"/>
+          </w:r>
+          <w:r>
+            <w:t xml:space="preserve"> von </w:t>
+          </w:r>
+          <w:r>
+            <w:fldChar w:fldCharType="begin"/>
+          </w:r>
+          <w:r>
+            <w:instrText xml:space="preserve"> NUMPAGES </w:instrText>
+          </w:r>
+          <w:r>
+            <w:fldChar w:fldCharType="end"/>
+          </w:r>
+        </w:p>
+      </w:tc>
+    </w:tr>
+  </w:tbl>
+</w:ftr>
+</file>
+
+<file path=word/header1.xml><?xml version="1.0" encoding="utf-8"?>
+<w:hdr xmlns:m="http://schemas.openxmlformats.org/officeDocument/2006/math" xmlns:mc="http://schemas.openxmlformats.org/markup-compatibility/2006" xmlns:mo="http://schemas.microsoft.com/office/mac/office/2008/main" xmlns:mv="urn:schemas-microsoft-com:mac:vml" xmlns:o="urn:schemas-microsoft-com:office:office" xmlns:r="http://schemas.openxmlformats.org/officeDocument/2006/relationships" xmlns:v="urn:schemas-microsoft-com:vml" xmlns:w10="urn:schemas-microsoft-com:office:word" xmlns:w14="http://schemas.microsoft.com/office/word/2010/wordml" xmlns:w="http://schemas.openxmlformats.org/wordprocessingml/2006/main" xmlns:wne="http://schemas.microsoft.com/office/word/2006/wordml" xmlns:wp14="http://schemas.microsoft.com/office/word/2010/wordprocessingDrawing" xmlns:wp="http://schemas.openxmlformats.org/drawingml/2006/wordprocessingDrawing" xmlns:wpc="http://schemas.microsoft.com/office/word/2010/wordprocessingCanvas" xmlns:wpg="http://schemas.microsoft.com/office/word/2010/wordprocessingGroup" xmlns:wpi="http://schemas.microsoft.com/office/word/2010/wordprocessingInk" xmlns:wps="http://schemas.microsoft.com/office/word/2010/wordprocessingShape" mc:Ignorable="w14 wp14">
+  <w:p>
+    <w:pPr>
+      <w:pStyle w:val="Header"/>
+      <w:jc w:val="right"/>
+    </w:pPr>
+    <w:r>
+      <w:t xml:space="preserve">{{ person_name }} – </w:t>
+    </w:r>
+    <w:r>
+      <w:fldChar w:fldCharType="begin"/>
+    </w:r>
+    <w:r>
+      <w:instrText xml:space="preserve"> STYLEREF "Überschrift 2" </w:instrText>
+    </w:r>
+    <w:r>
+      <w:fldChar w:fldCharType="end"/>
+    </w:r>
+  </w:p>
+</w:hdr>
 </file>
 
 <file path=word/numbering.xml><?xml version="1.0" encoding="utf-8"?>
@@ -1560,7 +2160,7 @@
       <w:rFonts w:asciiTheme="majorHAnsi" w:eastAsiaTheme="majorEastAsia" w:hAnsiTheme="majorHAnsi" w:cstheme="majorBidi"/>
       <w:b/>
       <w:bCs/>
-      <w:color w:val="365F91" w:themeColor="accent1" w:themeShade="BF"/>
+      <w:color w:val="000000"/>
       <w:sz w:val="28"/>
       <w:szCs w:val="28"/>
     </w:rPr>
@@ -1584,7 +2184,7 @@
       <w:rFonts w:asciiTheme="majorHAnsi" w:eastAsiaTheme="majorEastAsia" w:hAnsiTheme="majorHAnsi" w:cstheme="majorBidi"/>
       <w:b/>
       <w:bCs/>
-      <w:color w:val="4F81BD" w:themeColor="accent1"/>
+      <w:color w:val="000000"/>
       <w:sz w:val="26"/>
       <w:szCs w:val="26"/>
     </w:rPr>
@@ -1608,7 +2208,7 @@
       <w:rFonts w:asciiTheme="majorHAnsi" w:eastAsiaTheme="majorEastAsia" w:hAnsiTheme="majorHAnsi" w:cstheme="majorBidi"/>
       <w:b/>
       <w:bCs/>
-      <w:color w:val="4F81BD" w:themeColor="accent1"/>
+      <w:color w:val="000000"/>
     </w:rPr>
   </w:style>
   <w:style w:type="paragraph" w:styleId="Heading4">

</xml_diff>

<commit_message>
Profil + Word: Java-EE-Stack, Methodik, Architekturstil im IT-Know-How
- grammar: SubkategorieTyp Methodik hinzugefügt
- wg_enterprise: Methodik (Scrum, V-Modell), Web-UI (JSF), Container-Dienste
  (CDI, EJB, JMX), Test (JUnit, Mockito, Selenium, Arquillian), GraphQL, Jenkins
- taxonomy: Jenkins, JMS, JSF, JAXP, XSLT, EJB, CDI, Maven, Jira hinzugefügt
- word.py: Architekturstil als nicht-fetter Run im Wissensgebiet-Heading
- word.py: Tabellen-Padding auf 40 dxa reduziert

Co-Authored-By: Claude Sonnet 4.6 <noreply@anthropic.com>
</commit_message>
<xml_diff>
--- a/templates/profil.docx
+++ b/templates/profil.docx
@@ -15,10 +15,10 @@
           <w:insideV w:val="none" w:sz="0" w:space="0" w:color="auto"/>
         </w:tblBorders>
         <w:tblCellMar>
-          <w:top w:w="80" w:type="dxa"/>
-          <w:left w:w="80" w:type="dxa"/>
-          <w:bottom w:w="80" w:type="dxa"/>
-          <w:right w:w="80" w:type="dxa"/>
+          <w:top w:w="40" w:type="dxa"/>
+          <w:left w:w="40" w:type="dxa"/>
+          <w:bottom w:w="40" w:type="dxa"/>
+          <w:right w:w="40" w:type="dxa"/>
         </w:tblCellMar>
       </w:tblPr>
       <w:tblGrid>
@@ -259,10 +259,10 @@
         <w:tblW w:type="auto" w:w="0"/>
         <w:tblLook w:firstColumn="1" w:firstRow="1" w:lastColumn="0" w:lastRow="0" w:noHBand="0" w:noVBand="1" w:val="04A0"/>
         <w:tblCellMar>
-          <w:top w:w="80" w:type="dxa"/>
-          <w:left w:w="80" w:type="dxa"/>
-          <w:bottom w:w="80" w:type="dxa"/>
-          <w:right w:w="80" w:type="dxa"/>
+          <w:top w:w="40" w:type="dxa"/>
+          <w:left w:w="40" w:type="dxa"/>
+          <w:bottom w:w="40" w:type="dxa"/>
+          <w:right w:w="40" w:type="dxa"/>
         </w:tblCellMar>
       </w:tblPr>
       <w:tblGrid>
@@ -378,6 +378,12 @@
       <w:r>
         <w:t>{{ wg.titel }}</w:t>
       </w:r>
+      <w:r>
+        <w:rPr>
+          <w:b w:val="0"/>
+        </w:rPr>
+        <w:t>{% if wg.architekturstil %}  –  {{ wg.architekturstil }}{% endif %}</w:t>
+      </w:r>
     </w:p>
     <w:tbl>
       <w:tblPr>
@@ -385,10 +391,10 @@
         <w:tblW w:type="auto" w:w="0"/>
         <w:tblLook w:firstColumn="1" w:firstRow="1" w:lastColumn="0" w:lastRow="0" w:noHBand="0" w:noVBand="1" w:val="04A0"/>
         <w:tblCellMar>
-          <w:top w:w="80" w:type="dxa"/>
-          <w:left w:w="80" w:type="dxa"/>
-          <w:bottom w:w="80" w:type="dxa"/>
-          <w:right w:w="80" w:type="dxa"/>
+          <w:top w:w="40" w:type="dxa"/>
+          <w:left w:w="40" w:type="dxa"/>
+          <w:bottom w:w="40" w:type="dxa"/>
+          <w:right w:w="40" w:type="dxa"/>
         </w:tblCellMar>
       </w:tblPr>
       <w:tblGrid>
@@ -492,10 +498,10 @@
         <w:tblW w:type="auto" w:w="0"/>
         <w:tblLook w:firstColumn="1" w:firstRow="1" w:lastColumn="0" w:lastRow="0" w:noHBand="0" w:noVBand="1" w:val="04A0"/>
         <w:tblCellMar>
-          <w:top w:w="80" w:type="dxa"/>
-          <w:left w:w="80" w:type="dxa"/>
-          <w:bottom w:w="80" w:type="dxa"/>
-          <w:right w:w="80" w:type="dxa"/>
+          <w:top w:w="40" w:type="dxa"/>
+          <w:left w:w="40" w:type="dxa"/>
+          <w:bottom w:w="40" w:type="dxa"/>
+          <w:right w:w="40" w:type="dxa"/>
         </w:tblCellMar>
       </w:tblPr>
       <w:tblGrid>
@@ -669,10 +675,10 @@
         <w:tblW w:type="auto" w:w="0"/>
         <w:tblLook w:firstColumn="1" w:firstRow="1" w:lastColumn="0" w:lastRow="0" w:noHBand="0" w:noVBand="1" w:val="04A0"/>
         <w:tblCellMar>
-          <w:top w:w="80" w:type="dxa"/>
-          <w:left w:w="80" w:type="dxa"/>
-          <w:bottom w:w="80" w:type="dxa"/>
-          <w:right w:w="80" w:type="dxa"/>
+          <w:top w:w="40" w:type="dxa"/>
+          <w:left w:w="40" w:type="dxa"/>
+          <w:bottom w:w="40" w:type="dxa"/>
+          <w:right w:w="40" w:type="dxa"/>
         </w:tblCellMar>
       </w:tblPr>
       <w:tblGrid>
@@ -817,10 +823,10 @@
         <w:tblW w:type="auto" w:w="0"/>
         <w:tblLook w:firstColumn="1" w:firstRow="1" w:lastColumn="0" w:lastRow="0" w:noHBand="0" w:noVBand="1" w:val="04A0"/>
         <w:tblCellMar>
-          <w:top w:w="80" w:type="dxa"/>
-          <w:left w:w="80" w:type="dxa"/>
-          <w:bottom w:w="80" w:type="dxa"/>
-          <w:right w:w="80" w:type="dxa"/>
+          <w:top w:w="40" w:type="dxa"/>
+          <w:left w:w="40" w:type="dxa"/>
+          <w:bottom w:w="40" w:type="dxa"/>
+          <w:right w:w="40" w:type="dxa"/>
         </w:tblCellMar>
       </w:tblPr>
       <w:tblGrid>
@@ -986,10 +992,10 @@
         <w:tblW w:type="auto" w:w="0"/>
         <w:tblLook w:firstColumn="1" w:firstRow="1" w:lastColumn="0" w:lastRow="0" w:noHBand="0" w:noVBand="1" w:val="04A0"/>
         <w:tblCellMar>
-          <w:top w:w="80" w:type="dxa"/>
-          <w:left w:w="80" w:type="dxa"/>
-          <w:bottom w:w="80" w:type="dxa"/>
-          <w:right w:w="80" w:type="dxa"/>
+          <w:top w:w="40" w:type="dxa"/>
+          <w:left w:w="40" w:type="dxa"/>
+          <w:bottom w:w="40" w:type="dxa"/>
+          <w:right w:w="40" w:type="dxa"/>
         </w:tblCellMar>
       </w:tblPr>
       <w:tblGrid>
@@ -1160,10 +1166,10 @@
         <w:tblW w:type="auto" w:w="0"/>
         <w:tblLook w:firstColumn="1" w:firstRow="1" w:lastColumn="0" w:lastRow="0" w:noHBand="0" w:noVBand="1" w:val="04A0"/>
         <w:tblCellMar>
-          <w:top w:w="80" w:type="dxa"/>
-          <w:left w:w="80" w:type="dxa"/>
-          <w:bottom w:w="80" w:type="dxa"/>
-          <w:right w:w="80" w:type="dxa"/>
+          <w:top w:w="40" w:type="dxa"/>
+          <w:left w:w="40" w:type="dxa"/>
+          <w:bottom w:w="40" w:type="dxa"/>
+          <w:right w:w="40" w:type="dxa"/>
         </w:tblCellMar>
       </w:tblPr>
       <w:tblGrid>
@@ -1293,10 +1299,10 @@
         <w:tblW w:type="auto" w:w="0"/>
         <w:tblLook w:firstColumn="1" w:firstRow="1" w:lastColumn="0" w:lastRow="0" w:noHBand="0" w:noVBand="1" w:val="04A0"/>
         <w:tblCellMar>
-          <w:top w:w="80" w:type="dxa"/>
-          <w:left w:w="80" w:type="dxa"/>
-          <w:bottom w:w="80" w:type="dxa"/>
-          <w:right w:w="80" w:type="dxa"/>
+          <w:top w:w="40" w:type="dxa"/>
+          <w:left w:w="40" w:type="dxa"/>
+          <w:bottom w:w="40" w:type="dxa"/>
+          <w:right w:w="40" w:type="dxa"/>
         </w:tblCellMar>
       </w:tblPr>
       <w:tblGrid>
@@ -1431,10 +1437,10 @@
         <w:tblW w:type="auto" w:w="0"/>
         <w:tblLook w:firstColumn="1" w:firstRow="1" w:lastColumn="0" w:lastRow="0" w:noHBand="0" w:noVBand="1" w:val="04A0"/>
         <w:tblCellMar>
-          <w:top w:w="80" w:type="dxa"/>
-          <w:left w:w="80" w:type="dxa"/>
-          <w:bottom w:w="80" w:type="dxa"/>
-          <w:right w:w="80" w:type="dxa"/>
+          <w:top w:w="40" w:type="dxa"/>
+          <w:left w:w="40" w:type="dxa"/>
+          <w:bottom w:w="40" w:type="dxa"/>
+          <w:right w:w="40" w:type="dxa"/>
         </w:tblCellMar>
       </w:tblPr>
       <w:tblGrid>
@@ -1510,10 +1516,10 @@
         <w:tblW w:type="auto" w:w="0"/>
         <w:tblLook w:firstColumn="1" w:firstRow="1" w:lastColumn="0" w:lastRow="0" w:noHBand="0" w:noVBand="1" w:val="04A0"/>
         <w:tblCellMar>
-          <w:top w:w="80" w:type="dxa"/>
-          <w:left w:w="80" w:type="dxa"/>
-          <w:bottom w:w="80" w:type="dxa"/>
-          <w:right w:w="80" w:type="dxa"/>
+          <w:top w:w="40" w:type="dxa"/>
+          <w:left w:w="40" w:type="dxa"/>
+          <w:bottom w:w="40" w:type="dxa"/>
+          <w:right w:w="40" w:type="dxa"/>
         </w:tblCellMar>
       </w:tblPr>
       <w:tblGrid>

</xml_diff>